<commit_message>
2209-A odağını bağımsız Jammertest değerlendirmesine daralt
</commit_message>
<xml_diff>
--- a/output/docs/TUBITAK_2209A_GNSS_TYBS_Metin_Taslagi.docx
+++ b/output/docs/TUBITAK_2209A_GNSS_TYBS_Metin_Taslagi.docx
@@ -7,7 +7,7 @@
         <w:pStyle w:val="Title"/>
       </w:pPr>
       <w:r>
-        <w:t>TÜBİTAK 2209-A GNSS Araştırma Önerisi</w:t>
+        <w:t>Bağımsız Jammertest 2025 Verisinde GNSS Tutarsızlık İzleyicisinin Değerlendirilmesi</w:t>
       </w:r>
     </w:p>
     <w:p>
@@ -25,40 +25,20 @@
         <w:t>2026 TYBS başvuru alanları için düzenlenebilir metin taslağı</w:t>
       </w:r>
     </w:p>
-    <w:tbl>
-      <w:tblPr>
-        <w:tblStyle w:val="TableGrid"/>
-        <w:tblW w:type="auto" w:w="0"/>
-        <w:tblLook w:firstColumn="1" w:firstRow="1" w:lastColumn="0" w:lastRow="0" w:noHBand="0" w:noVBand="1" w:val="04A0"/>
-      </w:tblPr>
-      <w:tblGrid>
-        <w:gridCol w:w="10166"/>
-      </w:tblGrid>
-      <w:tr>
-        <w:tc>
-          <w:tcPr>
-            <w:tcW w:type="dxa" w:w="10166"/>
-            <w:shd w:fill="FFF2CC"/>
-            <w:vAlign w:val="center"/>
-          </w:tcPr>
-          <w:p>
-            <w:pPr>
-              <w:spacing w:after="20" w:line="240" w:lineRule="auto"/>
-            </w:pPr>
-            <w:r/>
-            <w:r>
-              <w:rPr>
-                <w:rFonts w:ascii="Arial" w:hAnsi="Arial"/>
-                <w:b w:val="0"/>
-                <w:sz w:val="18"/>
-              </w:rPr>
-              <w:t>KULLANIM NOTU  2026 çağrısında araştırma önerisi TYBS alanlarına girilir ve sistem tarafından oluşturulur; bu Word dosyası başvuruya yüklenecek belge değildir. İndirilen PDF 2024 dönemine ait ve başka bir projeyi içeriyor. Bu taslaktaki köşeli parantezli alanlar, yöntem, kaynaklar ve AI kullanım beyanı başvuru sahibi ile danışman tarafından doğrulanmalıdır.</w:t>
-            </w:r>
-          </w:p>
-        </w:tc>
-      </w:tr>
-    </w:tbl>
-    <w:p/>
+    <w:p>
+      <w:pPr>
+        <w:widowControl/>
+        <w:spacing w:after="160"/>
+      </w:pPr>
+      <w:r>
+        <w:rPr>
+          <w:rFonts w:ascii="Arial" w:hAnsi="Arial"/>
+          <w:i w:val="0"/>
+          <w:sz w:val="18"/>
+        </w:rPr>
+        <w:t>Kullanım notu: 2026 çağrısında öneri TYBS alanlarına girilir ve sistem tarafından oluşturulur; bu Word dosyası yükleme belgesi değildir. Sağlanan PDF 2024 döneminden ve başka bir projeye aittir. Köşeli parantezli bilgiler, veri erişimi, yöntem ve kaynaklar başvuru sahibi ile danışman tarafından doğrulanmalıdır.</w:t>
+      </w:r>
+    </w:p>
     <w:p>
       <w:pPr>
         <w:pStyle w:val="Heading1"/>
@@ -168,7 +148,7 @@
                 <w:b w:val="0"/>
                 <w:sz w:val="16"/>
               </w:rPr>
-              <w:t>Heterojen GNSS Ölçüm Kayıtlarında Alıcıya Duyarlı Tutarsızlık İzleme Yöntemlerinin İncelenmesi</w:t>
+              <w:t>Bağımsız Jammertest 2025 Verisinde GNSS Tutarsızlık İzleyicisinin Değerlendirilmesi</w:t>
             </w:r>
           </w:p>
         </w:tc>
@@ -491,7 +471,7 @@
                 <w:b w:val="0"/>
                 <w:sz w:val="16"/>
               </w:rPr>
-              <w:t>GNSS; spoofing; jamming; ölçüm tutarlılığı; alıcı profili; code-minus-carrier</w:t>
+              <w:t>GNSS; Jammertest 2025; bağımsız değerlendirme; Septentrio PolaRx5; spoofing; jamming</w:t>
             </w:r>
           </w:p>
         </w:tc>
@@ -520,7 +500,7 @@
           <w:rFonts w:ascii="Arial" w:hAnsi="Arial"/>
           <w:i w:val="0"/>
         </w:rPr>
-        <w:t>Küresel uydu seyrüsefer sistemlerine (GNSS) yönelik spoofing ve jamming farklı tehditlerdir; alıcının dışarı verdiği ölçümler her iki durumda da tek başına saldırı nedenini kanıtlamaz. Bu projede, farklı kayıt biçimlerinden ortak gözlem şemasına dönüştürülen GNSS verilerinde ölçüm tutarsızlığı izleme yöntemlerinin veri kaynağı, gözlenebilir ölçütler ve alıcı profiline göre nasıl davrandığı incelenecektir. Araştırma, mevcut bir yazılım prototipinin bağımsız performans iddiası olarak değil, tekrarlanabilir kayıt temelli değerlendirme olarak tasarlanmıştır. Önce veri kaynakları, zaman çizelgeleri, ölçüm alanları ve lisans bilgileri manifestlerle kaydedilecek; kod, karar eşikleri ve değerlendirme protokolü test verileri açılmadan dondurulacaktır. Kaynağa özgü adaptörler zaman, birim, geçerli fix ve eksik ölçümleri koruyarak ortak şemaya aktarılacak; alıcı profilleri yalnızca ayrı normal kalibrasyon oturumlarından üretilecektir. Önceden ayrılmış test kayıtlarında ölçüm kapsamı, olay düzeyinde yeni alarm, kaçırılan olay ve ilk alarm gecikmesi raporlanacak; yanlış alarm oranı yalnızca veri sağlayıcısı veya bağımsız protokolce doğrulanmış temiz süreler için hesaplanacaktır. Mevcut TEXBAT ve Jammertest sonuçları ön çalışma niteliğindedir; aynı kayıtlar geliştirme ve ayarlamada kullanıldığı için bağımsız başarı kanıtı sayılmayacaktır. Yeni alıcıya ait bağımsız veri sağlanamazsa sonuçlar mevcut kayıtlarla sınırlı keşifsel bulgu olarak sunulacaktır. Proje sonunda sürümlenmiş veri sözlüğü, tekrar çalıştırılabilir değerlendirme betikleri ve alıcı/veri kapsamını açıkça belirten bir araştırma raporu hazırlanacaktır.</w:t>
+        <w:t>Bu araştırma, mevcut GNSS ölçüm tutarlılığı izleme prototipinin daha önce geliştirme ve eşik ayarında kullanılmamış Jammertest 2025 kayıtlarına aktarılabilirliğini inceleyecektir. Veri kataloğu kayıtları Septentrio PolaRx5 alıcısından SBF/RINEX ölçümleri ve girişim senaryosu yer gerçeği içerdiğini bildiriyor; ancak dosya erişimi ve yerel şema doğrulaması henüz tamamlanmadı. Bu nedenle önce belirli veri sürümü, lisans, dosyalar, saat eşlemesi ve gözlenebilir alanlar doğrulanacak, test dosyaları açılmadan kod, model, profil, eşikler ve analiz protokolü dondurulacaktır. SBF veya RINEX kayıtları sürümlü adaptörle ortak şemaya aktarılacak; ölçüm kaybı, birim dönüşümü ve geçersiz örnekler kaydedilecek, kaynakta bulunmayan alanlar üretilmeyecektir. Saldırı etiketleri yalnızca çıkarım sonrası uygulanarak jamming ve spoofing olayları için olay düzeyinde yeni alarm, kaçırılan olay ve ilk alarm gecikmesi hesaplanacaktır. Yanlış alarm yalnızca yer gerçeğinde açıkça temiz/normal olarak tanımlanmış süre bulunursa raporlanacaktır. Mevcut TEXBAT ve Jammertest 2024 kayıtları geliştirme sürecinde incelendiği için bağımsız test sayılmayacaktır. 2025 dosyaları edinilemez veya gerekli alanları içermezse bağımsız performans iddiası kurulmayacak; kısıt, sonuç ve B planı açıkça raporlanacaktır.</w:t>
       </w:r>
     </w:p>
     <w:p>
@@ -534,7 +514,7 @@
           <w:color w:val="5B6573"/>
           <w:sz w:val="16"/>
         </w:rPr>
-        <w:t>Özet uzunluğu: 192 kelime (2026 çağrısı: 25-450 kelime).</w:t>
+        <w:t>Özet uzunluğu: 155 kelime (2026 çağrısı: 25-450 kelime).</w:t>
       </w:r>
     </w:p>
     <w:p>
@@ -564,7 +544,7 @@
           <w:color w:val="5B6573"/>
           <w:sz w:val="16"/>
         </w:rPr>
-        <w:t>TYBS metni (1,513 karakter; asgari 350)</w:t>
+        <w:t>TYBS metni (1,541 karakter; asgari 350)</w:t>
       </w:r>
     </w:p>
     <w:p>
@@ -577,7 +557,7 @@
           <w:rFonts w:ascii="Arial" w:hAnsi="Arial"/>
           <w:i w:val="0"/>
         </w:rPr>
-        <w:t>GNSS spoofing, alıcının yanlış fakat makul görünebilen ölçümlere yönelmesine; jamming ise sinyal hizmetinin bozulmasına yol açabilir. Bu iki tehdit ayrı değerlendirilmelidir. Literatür, tespit gücünün alıcı içi sinyal ölçütlerine, kod-taşıyıcı bilgisine, navigasyon artıklarına ve bağımsız sensörlere erişime bağlı olduğunu; alıcıya özgü normal dağılım ve açık yanlış alarm değerlendirmesinin önemini vurgular [1, 2]. Code-minus-carrier (CMC) eğimleri yardımcı tutarsızlık göstergesi olabilir; multipath, iyonosfer, gürültü ve alıcı işleminden de etkilenebildiğinden tek başına saldırı kanıtı değildir [3, 4]. Prototipin mevcut TEXBAT değerlendirmesi ham RF IQ yerine yayımlanmış işlenmiş GRID NAV ve kanal ölçümlerini kullanır. Jammertest NAV-PVT kayıtlarında C/N0 bulunmadığı için bu kaynakta RF/VAE özellikleri değerlendirilemez. Bu farklılıklar aynı algılayıcı skorlarını tüm veri biçimlerine taşımayı sakıncalı kılar. Araştırma sorusu şudur: “GNSS kayıtlarındaki gözlenebilir ölçütler, veri kaynağı ve alıcıya özgü normal profil, ortak bir tutarsızlık izleme prototipinin ölçüm kapsamını ve olay düzeyindeki alarm davranışını nasıl etkiler?” Çalışmanın özgün yönü yeni bir evrensel saldırı algılayıcısı iddia etmek değil; alan eksiklerini, profil kalibrasyonunu, zaman belirsizliğini ve olay düzeyindeki sonuçları önceden tanımlanmış bir protokolle birlikte incelemektir. Mevcut kayıtlarla elde edilen bulgular keşifseldir; farklı alıcıya genelleme ancak önceden ayrılmış bağımsız kayıtla sınanabilir [5, 6].</w:t>
+        <w:t>GNSS spoofing, alıcının yanlış fakat makul görünen ölçümlere yönelmesine; jamming ise sinyal hizmetinin bozulmasına yol açabilir ve iki tehdit ayrı değerlendirilmelidir. Literatür, tespit performansının alıcıda erişilebilen sinyal/ölçüm özelliklerine ve alıcıya özgü kalibrasyona bağlı olduğunu; yanlış alarm sınırının açık tanımlanması gerektiğini gösterir [1, 2]. Code-minus-carrier ölçütleri yardımcı olabilir, ancak multipath ve iyonosferden de etkilendiğinden tek başına saldırı kanıtı değildir [3, 4]. Bu nedenle bir kayıt üzerinde ayarlanan prototipin farklı alıcı ve veri biçiminde aynı davranışı göstereceği varsayılamaz. Etsin kataloğu, FGI Jammertest 2025 veri kümesini Septentrio PolaRx5 alıcı kayıtları, SBF/RINEX biçimleri ve senaryo yer gerçeğiyle tanımlar [7]. Prototipin mevcut değerlendirmeleri TEXBAT işlenmiş GRID ölçümleri, Jammertest 2024 ve başka kaynaklarla sınırlıdır; bunlar geliştirme sürecinde incelendiğinden bağımsız test değildir. Bununla birlikte 2025 kümesinin dosyaları henüz alınarak incelenmedi ve uygulamanın SBF/RINEX desteği doğrulanmadı. Araştırma sorusu şudur: “Önceden dondurulmuş GNSS tutarsızlık izleme prototipi, daha önce kullanılmamış Jammertest 2025 PolaRx5 kayıtlarında etiketli jamming ve spoofing olaylarını hangi kapsam ve gecikmeyle belirler; açıkça temiz etiketlenmiş süre varsa ne sıklıkta alarm üretir?” Çalışma yeni bir evrensel tespit yöntemi iddia etmeyecek; veri erişimi, gözlenebilir alanlar, uyarlama ve olay düzeyindeki performans sınırlarını tekrarlanabilir biçimde ölçecektir.</w:t>
       </w:r>
     </w:p>
     <w:p>
@@ -599,7 +579,7 @@
           <w:color w:val="5B6573"/>
           <w:sz w:val="16"/>
         </w:rPr>
-        <w:t>TYBS metni (1,141 karakter; asgari 350)</w:t>
+        <w:t>TYBS metni (1,107 karakter; asgari 350)</w:t>
       </w:r>
     </w:p>
     <w:p>
@@ -612,7 +592,7 @@
           <w:rFonts w:ascii="Arial" w:hAnsi="Arial"/>
           <w:i w:val="0"/>
         </w:rPr>
-        <w:t>Projenin amacı, heterojen GNSS kayıtlarında mevcut ölçüm tutarlılığı izleme bileşenlerinin hangi veri ve alıcı koşullarında değerlendirilebilir olduğunu ölçmek ve sınırlamalarını tekrarlanabilir biçimde raporlamaktır. İlk hedef, en az iki farklı kayıt/ölçüm sözleşmesi için alan, birim, zaman ve fix-geçerliliği eşlemesini kaynak manifestleriyle belgelemektir. İkinci hedef, normal profilin eğitim ve doğrulama/test verilerinin oturum bazında ayrıldığı bir protokol kurmak; test kayıtlarından eşik veya profil seçimi yapmamaktır. Üçüncü hedef, önceden doğrulanmış saldırı zaman çizelgeleri bulunan kayıtlarda olay düzeyinde yeni alarmı, kaçırılan olayları ve ilk alarm gecikmesini; doğrulanmış temiz oturumlarda temiz süre başına alarmı raporlamaktır. Dördüncü hedef, C/N0, CMC, fix geçerliliği ve bağımsız navigasyon ölçümlerinin mevcut olmadığı kaynaklarda hangi ölçütlerin çalıştırılamadığını göstermek ve bu eksikliği kestirimle doldurmamaktır. Başarı, algılayıcının her saldırıyı yakalaması değil; veri ve yöntem ayrımının korunması, analizlerin yeniden üretilebilmesi ve sonuçların kanıt kapsamına uygun raporlanması olarak tanımlanır.</w:t>
+        <w:t>Projenin amacı, geliştirme verilerinden ayrı Jammertest 2025 PolaRx5 kayıtlarında mevcut GNSS tutarsızlık izleme prototipinin sıfır-atış aktarım performansını ölçmek ve kapsam sınırlarını raporlamaktır. İlk hedef, veri kataloğundaki sürüm, indirme izni, lisans, dosya listesi, yer gerçeği ve olay saatlerini doğrulayıp SHA-256 manifesti hazırlamaktır. İkinci hedef, veri dosyasında bulunduğu doğrulanan SBF veya RINEX alanlarını zaman ve birim bilgilerini koruyarak ortak şemaya aktaran, testlerle doğrulanmış bir adaptör geliştirmektir. Üçüncü hedef, prototip sürümünü, yapılandırmayı, profilleri, eşikleri ve metrikleri saldırı kayıtları açılmadan dondurup testi yeniden ayarlama yapmadan çalıştırmaktır. Dördüncü hedef, jamming ve spoofing olaylarını ayrı raporlayarak olay düzeyinde yeni alarm, kaçırma ve gecikmeyi hesaplamaktır; yanlış alarm oranı yalnızca yer gerçeğinde açıkça temiz olduğu belirtilen zamanlar varsa verilecektir. Başarı, yüksek tespit oranı vaat etmek değil; kilitli bağımsız değerlendirmeyi, veri/özellik kapsamını ve başarısız sonuçları yeniden üretilebilir biçimde raporlamaktır.</w:t>
       </w:r>
     </w:p>
     <w:p>
@@ -642,7 +622,7 @@
           <w:color w:val="5B6573"/>
           <w:sz w:val="16"/>
         </w:rPr>
-        <w:t>TYBS metni (1,473 karakter; asgari 350)</w:t>
+        <w:t>TYBS metni (1,448 karakter; asgari 350)</w:t>
       </w:r>
     </w:p>
     <w:p>
@@ -655,7 +635,7 @@
           <w:rFonts w:ascii="Arial" w:hAnsi="Arial"/>
           <w:i w:val="0"/>
         </w:rPr>
-        <w:t>Araştırma, kayıt temelli ve karşılaştırmalı bir değerlendirmedir. Bağımsız değişkenler veri kaynağı/formatı, ölçüt alanlarının bulunabilirliği (PVT, hız, fix durumu, C/N0, pseudorange ve taşıyıcı fazı) ve alıcı profili kullanımıdır. Bağımlı çıktılar geçerli örnek kapsamı, her olayda saldırı başlangıcından sonra oluşan ilk yeni alarmın varlığı, olay düzeyinde kaçırma ve tespit gecikmesi; doğrulanmış normal oturumlarda ise alarm/temiz saat oranıdır. Bir alarm saldırı türünü tek başına doğrulamaz. Kod sürümü, yapılandırma, profil, kaynak dosya SHA-256 değerleri, olay zaman çizelgesi ve metrik tanımları testten önce dondurulacaktır. Saldırı etiketleri model girdisine verilmeyecek; yalnız sonuçları zaman pencereleriyle karşılaştırmak için kullanılacaktır. Zaman damgaları UTC'ye çevrilecek, ölçüm birimleri kaynak sözleşmesine göre doğrulanacak, fix kaybı ve eksik alanlar korunacak, geçersiz örnekler gerekçesiyle kaydedilecektir. Profil oluşturulacaksa normal eğitim ve doğrulama oturumları, kilitli test oturumundan ve mümkün olduğunda farklı kayıtlardan ayrılacaktır. Sonuçlar önce kayıt ve alıcı bazında raporlanacak; olay oranları için sayılar ve uygun güven aralıkları, gecikmeler için dağılım/ortanca verilecektir. Yanlış alarm oranı ancak sertifikalı veya protokolce doğrulanmış temiz zaman paydası varsa hesaplanacaktır. Aynı veri üzerinde eşik ayarı sonrası alınan skorlar keşifsel sayılacak; bağımsız veri yoksa genelleme iddiası kurulmayacaktır [2, 5, 7].</w:t>
+        <w:t>Araştırma, önceden geliştirme ve ayar süreçlerinde kullanılmamış Jammertest 2025 PolaRx5 kayıtlarında yapılacak, kayıt temelli sıfır-atış değerlendirmedir. Önce katalog sürümü, indirme erişimi, lisans, dosya listesi, yayınlanmış biçim açıklaması ve olay saatlerinin tanımı doğrulanır; dosyalar edinilebilirse bayt düzeyinde SHA-256 manifesti çıkarılır. SBF/RINEX dönüştürücüsü yalnızca yayınlanmış alan sözleşmesi ve yapay test örnekleriyle hazırlanır. Gerçek test ölçümleri veya saldırı etiketleri çözülmeden prototip kodu, model dosyaları, mevcut profil, eşikler, yapılandırma, adaptör ve analiz protokolü SHA-256 ile dondurulur. Sonra ölçümler ortak şemaya aktarılır; zaman birimleri, epoch atlamaları, geçersiz fix ve eksik alanlar korunur. Olmayan C/N0, pseudorange, taşıyıcı fazı veya temiz etiket türetilmez. Jamming ve spoofing etiketleri yalnızca dondurulmuş çıkarım tamamlandıktan sonra uygulanır ve ayrı raporlanır; temel çıktılar olay başına yeni alarm, kaçırılan olay sayısı ve ilk yeni alarm gecikmesidir. Alarmın olay başında zaten etkin olması yeni tespit sayılmaz. Gecikme için olay saati belirsizliği ve kaydın sonuna kadar tespit edilmeyen olaylar gösterilir. Yanlış alarm/saat yalnızca veri sağlayıcının yer gerçeğinde açıkça temiz/normal olarak işaretlediği sürelerde hesaplanır; böyle süre yoksa bu metrik verilmez. Dönüştürme veya erişim başarısızsa performans sonucu üretilmez; bu durum ve sınırlı B planı raporlanır [2, 7].</w:t>
       </w:r>
     </w:p>
     <w:p>
@@ -680,7 +660,7 @@
           <w:rFonts w:ascii="Arial" w:hAnsi="Arial"/>
           <w:i w:val="0"/>
         </w:rPr>
-        <w:t>Mevcut raporlardaki ön çalışma ölçümleri başvuruya başarı iddiası olarak taşınmamıştır. Jammertest 2024 replay'inde 33 kayıtlı olayın 12'sinde saldırı başlangıcından sonra yeni alarm kenarı oluşmuş; bu olaylarda ortanca gecikme 428,3 saniye ölçülmüştür. Veri sağlayıcının olay dışı aralıkları sertifikalı temiz olmadığından yanlış alarm oranı hesaplanmamıştır. TEXBAT güncel replay'inde DS2 kapsamı %99,77 ve ilk yeni alarm gecikmesi 0,90 saniye; DS7 kapsamı %98,49 ve gecikme 5,60 saniyedir. DS3'te alarm saldırı başlangıcında zaten etkin olduğundan yeni alarm gecikmesi ölçülememiştir. Bu kayıtların profili/parametreleri geliştirme sürecinde incelendiğinden sonuçlar aynı benchmark için keşifseldir ve bağımsız test değildir. Proje öncesinde bu raporlarla ölçüm ve kod sürümü danışmanla tekrar doğrulanacaktır.</w:t>
+        <w:t>Mevcut raporlardaki ön çalışma ölçümleri başvuruya bağımsız başarı iddiası olarak taşınmamıştır. Jammertest 2024 replay'inde 33 kayıtlı olayın 12'sinde saldırı başlangıcından sonra yeni alarm kenarı oluşmuş; bu olaylarda ortanca gecikme 428,3 saniye ölçülmüştür [8]. Veri sağlayıcının olay dışı aralıkları sertifikalı temiz olmadığından yanlış alarm oranı hesaplanmamıştır. TEXBAT güncel replay'inde DS2 kapsamı %99,77 ve ilk yeni alarm gecikmesi 0,90 saniye; DS7 kapsamı %98,49 ve gecikme 5,60 saniyedir [5, 6]. DS3'te alarm saldırı başlangıcında zaten etkin olduğundan yeni alarm gecikmesi ölçülememiştir. Bu kayıtların profili/parametreleri geliştirme sürecinde incelendiğinden sonuçlar aynı benchmark için keşifseldir ve bağımsız test değildir. Proje öncesinde bu raporlarla ölçüm ve kod sürümü danışmanla tekrar doğrulanacaktır.</w:t>
       </w:r>
     </w:p>
     <w:p>
@@ -839,7 +819,7 @@
                 <w:b w:val="0"/>
                 <w:sz w:val="15"/>
               </w:rPr>
-              <w:t>1. Veri ve protokol dondurma</w:t>
+              <w:t>1. Erişim ve test protokolünü dondurma</w:t>
             </w:r>
           </w:p>
         </w:tc>
@@ -879,7 +859,7 @@
                 <w:b w:val="0"/>
                 <w:sz w:val="15"/>
               </w:rPr>
-              <w:t>Kullanılacak her kaynak için kimlik, lisans, SHA-256, alan sözlüğü ve olay zaman çizelgesi kaydedilir; analiz protokolü ve metrik tanımları test çıktıları incelenmeden yazılı olarak dondurulur.</w:t>
+              <w:t>FGI Jammertest 2025 dosya erişimi, lisans, sürüm, SHA-256 ve yer gerçeği doğrulanır. Erişim sağlanamazsa analiz başlamaz ve durum danışmanla yeniden kapsamlandırılır.</w:t>
             </w:r>
           </w:p>
         </w:tc>
@@ -925,7 +905,7 @@
                 <w:b w:val="0"/>
                 <w:sz w:val="15"/>
               </w:rPr>
-              <w:t>2. Kaynak adaptörleri ve kalite kontrolü</w:t>
+              <w:t>2. SBF/RINEX adaptörü ve kalite kontrolü</w:t>
             </w:r>
           </w:p>
         </w:tc>
@@ -967,7 +947,7 @@
                 <w:b w:val="0"/>
                 <w:sz w:val="15"/>
               </w:rPr>
-              <w:t>En az iki veri sözleşmesi ortak gözlem şemasına aktarılır. Zaman, birim, eksik alan ve fix-geçerliliği testleri geçer; reddedilen veya dönüştürülemeyen her örnek gerekçesiyle sayılır.</w:t>
+              <w:t>Erişilebilir kaynak biçimi ortak gözlem şemasına aktarılır. Saat, birim, eksik alan ve fix/epoch kalite testleri geçer; dönüşüm kayıpları sayılır.</w:t>
             </w:r>
           </w:p>
         </w:tc>
@@ -988,7 +968,7 @@
                 <w:b w:val="0"/>
                 <w:sz w:val="15"/>
               </w:rPr>
-              <w:t>%20</w:t>
+              <w:t>%25</w:t>
             </w:r>
           </w:p>
         </w:tc>
@@ -1013,7 +993,7 @@
                 <w:b w:val="0"/>
                 <w:sz w:val="15"/>
               </w:rPr>
-              <w:t>3. Alıcı profili ayrımı</w:t>
+              <w:t>3. Prototip ve analiz protokolünü kilitleme</w:t>
             </w:r>
           </w:p>
         </w:tc>
@@ -1033,7 +1013,7 @@
                 <w:b w:val="0"/>
                 <w:sz w:val="15"/>
               </w:rPr>
-              <w:t>Ay 4-6</w:t>
+              <w:t>Ay 4-5</w:t>
             </w:r>
           </w:p>
         </w:tc>
@@ -1053,7 +1033,7 @@
                 <w:b w:val="0"/>
                 <w:sz w:val="15"/>
               </w:rPr>
-              <w:t>Normal profil yalnızca tanımlanmış eğitim oturumundan üretilir; doğrulama ve test verisi ayrı oturum/kayıt olarak manifestte izlenir. Ayrım sağlanamazsa profil sonucu keşifsel olarak işaretlenir.</w:t>
+              <w:t>Kod, model, mevcut alıcı profili, eşikler ve metrikler SHA-256 manifestiyle saldırı sonuçları açılmadan dondurulur; test verisinden ayar yapılmaz.</w:t>
             </w:r>
           </w:p>
         </w:tc>
@@ -1073,7 +1053,7 @@
                 <w:b w:val="0"/>
                 <w:sz w:val="15"/>
               </w:rPr>
-              <w:t>%20</w:t>
+              <w:t>%15</w:t>
             </w:r>
           </w:p>
         </w:tc>
@@ -1099,7 +1079,7 @@
                 <w:b w:val="0"/>
                 <w:sz w:val="15"/>
               </w:rPr>
-              <w:t>4. Kilitli olay ve temiz oturum değerlendirmesi</w:t>
+              <w:t>4. Bağımsız olay değerlendirmesi</w:t>
             </w:r>
           </w:p>
         </w:tc>
@@ -1120,7 +1100,7 @@
                 <w:b w:val="0"/>
                 <w:sz w:val="15"/>
               </w:rPr>
-              <w:t>Ay 7-10</w:t>
+              <w:t>Ay 6-9</w:t>
             </w:r>
           </w:p>
         </w:tc>
@@ -1141,7 +1121,7 @@
                 <w:b w:val="0"/>
                 <w:sz w:val="15"/>
               </w:rPr>
-              <w:t>Önceden etiketlenmiş olay pencereleri ve doğrulanmış temiz süreler ayrı analiz edilir. Olay düzeyinde yeni alarm, kaçırma ve gecikme; temiz oturumda yalnızca geçerli temiz payda varsa alarm/saat raporlanır.</w:t>
+              <w:t>Jamming ve spoofing etiketleri çıkarım sonrası uygulanır. Olay düzeyinde yeni alarm, kaçırma ve gecikme raporlanır; yanlış alarm yalnız doğrulanmış temiz süre varsa hesaplanır.</w:t>
             </w:r>
           </w:p>
         </w:tc>
@@ -1187,7 +1167,7 @@
                 <w:b w:val="0"/>
                 <w:sz w:val="15"/>
               </w:rPr>
-              <w:t>5. Tekrarlanabilir analiz paketi</w:t>
+              <w:t>5. Tekrarlanabilir analiz ve rapor</w:t>
             </w:r>
           </w:p>
         </w:tc>
@@ -1227,7 +1207,7 @@
                 <w:b w:val="0"/>
                 <w:sz w:val="15"/>
               </w:rPr>
-              <w:t>Sürüm, yapılandırma, manifest ve sonuç tablolarıyla aynı metrikleri yeniden üreten betikler hazırlanır; bulgular, başarısızlıklar ve kapsam sınırları birlikte raporlanır.</w:t>
+              <w:t>Sürüm, yapılandırma, manifest ve sonuç tablolarıyla analizi yeniden üreten betikler tamamlanır; bulgular ve veri/alıcının sınırları raporlanır.</w:t>
             </w:r>
           </w:p>
         </w:tc>
@@ -1370,7 +1350,7 @@
                 <w:b w:val="0"/>
                 <w:sz w:val="15"/>
               </w:rPr>
-              <w:t>Yeni ve bağımsız alıcı kaydının veya 2025 Jammertest dosyalarının zamanında edinilememesi</w:t>
+              <w:t>FGI Jammertest 2025 dosyalarının indirilememesi veya erişim koşulunun değişmesi</w:t>
             </w:r>
           </w:p>
         </w:tc>
@@ -1390,7 +1370,7 @@
                 <w:b w:val="0"/>
                 <w:sz w:val="15"/>
               </w:rPr>
-              <w:t>Orta / yüksek. Mevcut 2024 Jammertest, TEXBAT ve CMU kayıtları önceki geliştirme/değerlendirmelerde incelendi.</w:t>
+              <w:t>Orta / yüksek. Katalog kaydı var; yerel dosya erişimi henüz doğrulanmadı.</w:t>
             </w:r>
           </w:p>
         </w:tc>
@@ -1410,7 +1390,7 @@
                 <w:b w:val="0"/>
                 <w:sz w:val="15"/>
               </w:rPr>
-              <w:t>Öncelikle veri erişimi ve kurum laboratuvarındaki yeni normal oturum imkânı başlangıçta doğrulanır. Bağımsız test sağlanamazsa çalışma, yeniden analiz ve veri-kapsamı karşılaştırması olarak sınırlandırılır; bağımsız başarı veya çapraz-alıcı genelleme iddiası verilmez.</w:t>
+              <w:t>Başlangıçta yayıncı/katalog erişimi ve lisans yazılı olarak teyit edilir. Dosyalar edinilemezse bağımsız performans sonucu veya genelleme iddiası kurulmaz; danışmanla kapsam yeniden belirlenir ve yalnızca erişilebilir veriler için veri-kapsamı analizi yapılır.</w:t>
             </w:r>
           </w:p>
         </w:tc>
@@ -1436,7 +1416,7 @@
                 <w:b w:val="0"/>
                 <w:sz w:val="15"/>
               </w:rPr>
-              <w:t>Saldırı zaman çizelgesi veya kaynak saati belirsizliği</w:t>
+              <w:t>SBF/RINEX şemasının veya olay zaman çizelgesinin prototiple uyumsuz olması</w:t>
             </w:r>
           </w:p>
         </w:tc>
@@ -1457,7 +1437,7 @@
                 <w:b w:val="0"/>
                 <w:sz w:val="15"/>
               </w:rPr>
-              <w:t>Orta / yüksek. Bazı kaynaklarda olay logu saati ile ölçüm saati farklı olabilir.</w:t>
+              <w:t>Orta / yüksek. Projede bu biçimler için adaptör yok.</w:t>
             </w:r>
           </w:p>
         </w:tc>
@@ -1478,7 +1458,7 @@
                 <w:b w:val="0"/>
                 <w:sz w:val="15"/>
               </w:rPr>
-              <w:t>Kaynak yayıncı belgeleri ve bağımsız zaman çizelgesi karşılaştırılır; uyuşmaz zamanlar ayrı senaryo olarak raporlanır. Güvenilir başlangıç/bitiş yoksa tespit gecikmesi hesaplanmaz.</w:t>
+              <w:t>Önce tek bir kaynak biçimi seçilip alan eşlemesi test edilir. Saat, birim veya olay etiketi doğrulanamayan kayıtlar performans paydasına alınmaz; uyumlu bir kayıt yoksa sonuç sınırlılığı raporlanır.</w:t>
             </w:r>
           </w:p>
         </w:tc>
@@ -1503,6 +1483,72 @@
                 <w:b w:val="0"/>
                 <w:sz w:val="15"/>
               </w:rPr>
+              <w:t>Saldırı zaman çizelgesi veya kaynak saati belirsizliği</w:t>
+            </w:r>
+          </w:p>
+        </w:tc>
+        <w:tc>
+          <w:tcPr>
+            <w:tcW w:type="dxa" w:w="3168"/>
+            <w:vAlign w:val="center"/>
+          </w:tcPr>
+          <w:p>
+            <w:pPr>
+              <w:spacing w:after="20" w:line="240" w:lineRule="auto"/>
+            </w:pPr>
+            <w:r/>
+            <w:r>
+              <w:rPr>
+                <w:rFonts w:ascii="Arial" w:hAnsi="Arial"/>
+                <w:b w:val="0"/>
+                <w:sz w:val="15"/>
+              </w:rPr>
+              <w:t>Orta / yüksek. Olay takvimi ile alıcı saati farklı olabilir.</w:t>
+            </w:r>
+          </w:p>
+        </w:tc>
+        <w:tc>
+          <w:tcPr>
+            <w:tcW w:type="dxa" w:w="4464"/>
+            <w:vAlign w:val="center"/>
+          </w:tcPr>
+          <w:p>
+            <w:pPr>
+              <w:spacing w:after="20" w:line="240" w:lineRule="auto"/>
+            </w:pPr>
+            <w:r/>
+            <w:r>
+              <w:rPr>
+                <w:rFonts w:ascii="Arial" w:hAnsi="Arial"/>
+                <w:b w:val="0"/>
+                <w:sz w:val="15"/>
+              </w:rPr>
+              <w:t>Kaynak belgeleri karşılaştırılır; belirsizlik raporlanır. Güvenilir başlangıç/bitiş yoksa tespit gecikmesi hesaplanmaz.</w:t>
+            </w:r>
+          </w:p>
+        </w:tc>
+      </w:tr>
+      <w:tr>
+        <w:trPr>
+          <w:cantSplit/>
+        </w:trPr>
+        <w:tc>
+          <w:tcPr>
+            <w:tcW w:type="dxa" w:w="2448"/>
+            <w:vAlign w:val="center"/>
+            <w:shd w:fill="F4F7FA"/>
+          </w:tcPr>
+          <w:p>
+            <w:pPr>
+              <w:spacing w:after="20" w:line="240" w:lineRule="auto"/>
+            </w:pPr>
+            <w:r/>
+            <w:r>
+              <w:rPr>
+                <w:rFonts w:ascii="Arial" w:hAnsi="Arial"/>
+                <w:b w:val="0"/>
+                <w:sz w:val="15"/>
+              </w:rPr>
               <w:t>C/N0, CMC, IMU veya temiz etiketlerin kaynakta bulunmaması</w:t>
             </w:r>
           </w:p>
@@ -1511,6 +1557,7 @@
           <w:tcPr>
             <w:tcW w:type="dxa" w:w="3168"/>
             <w:vAlign w:val="center"/>
+            <w:shd w:fill="F4F7FA"/>
           </w:tcPr>
           <w:p>
             <w:pPr>
@@ -1531,6 +1578,7 @@
           <w:tcPr>
             <w:tcW w:type="dxa" w:w="4464"/>
             <w:vAlign w:val="center"/>
+            <w:shd w:fill="F4F7FA"/>
           </w:tcPr>
           <w:p>
             <w:pPr>
@@ -1556,7 +1604,6 @@
           <w:tcPr>
             <w:tcW w:type="dxa" w:w="2448"/>
             <w:vAlign w:val="center"/>
-            <w:shd w:fill="F4F7FA"/>
           </w:tcPr>
           <w:p>
             <w:pPr>
@@ -1577,7 +1624,6 @@
           <w:tcPr>
             <w:tcW w:type="dxa" w:w="3168"/>
             <w:vAlign w:val="center"/>
-            <w:shd w:fill="F4F7FA"/>
           </w:tcPr>
           <w:p>
             <w:pPr>
@@ -1598,7 +1644,6 @@
           <w:tcPr>
             <w:tcW w:type="dxa" w:w="4464"/>
             <w:vAlign w:val="center"/>
-            <w:shd w:fill="F4F7FA"/>
           </w:tcPr>
           <w:p>
             <w:pPr>
@@ -1624,6 +1669,7 @@
           <w:tcPr>
             <w:tcW w:type="dxa" w:w="2448"/>
             <w:vAlign w:val="center"/>
+            <w:shd w:fill="F4F7FA"/>
           </w:tcPr>
           <w:p>
             <w:pPr>
@@ -1644,6 +1690,7 @@
           <w:tcPr>
             <w:tcW w:type="dxa" w:w="3168"/>
             <w:vAlign w:val="center"/>
+            <w:shd w:fill="F4F7FA"/>
           </w:tcPr>
           <w:p>
             <w:pPr>
@@ -1664,6 +1711,7 @@
           <w:tcPr>
             <w:tcW w:type="dxa" w:w="4464"/>
             <w:vAlign w:val="center"/>
+            <w:shd w:fill="F4F7FA"/>
           </w:tcPr>
           <w:p>
             <w:pPr>
@@ -1952,7 +2000,7 @@
                 <w:b w:val="0"/>
                 <w:sz w:val="15"/>
               </w:rPr>
-              <w:t>TEXBAT işlenmiş GRID ölçümleri, Jammertest NAV-PVT/event kayıtları ve yalnız pilot/ön çalışma amacıyla ilgili CMU kayıtları.</w:t>
+              <w:t>FGI Jammertest 2025 PolaRx5 kayıtları bu araştırmanın bağımsız test adayıdır; önceki TEXBAT/Jammertest kayıtları yalnız geliştirme/ön çalışma içindir.</w:t>
             </w:r>
           </w:p>
         </w:tc>
@@ -1972,7 +2020,7 @@
                 <w:b w:val="0"/>
                 <w:sz w:val="15"/>
               </w:rPr>
-              <w:t>Dosya listesi, lisans, SHA-256 ve her kaydın geliştirme/test statüsü yeniden doğrulanmalı. Yeni bağımsız kayıt erişimi garanti edilmemiştir.</w:t>
+              <w:t>2025 dosyalarının indirme erişimi, lisansı, sürümü, alanları ve yer gerçeği başvuru öncesi doğrulanmalı; yerel SBF/RINEX desteği geliştirilmelidir.</w:t>
             </w:r>
           </w:p>
         </w:tc>
@@ -2068,7 +2116,7 @@
           <w:rFonts w:ascii="Arial" w:hAnsi="Arial"/>
           <w:i w:val="0"/>
         </w:rPr>
-        <w:t>Proje, farklı GNSS kayıtlarının aynı adla değerlendirilmesinin doğurabileceği kapsam ve kalibrasyon sorunlarını ölçülebilir biçimde görünür kılacaktır. Beklenen çıktılar; (i) kaynak, lisans, birim, zaman ve alan kapsamını açıklayan bir veri sözlüğü ve manifest, (ii) ölçüm dönüşümlerini doğrulayan testler ve tekrar çalıştırılabilir analiz betikleri, (iii) kayıt ve alıcı bazında olay kapsamı, gecikme ve yalnızca doğrulanmış temiz sürelerde yanlış alarm ölçümlerini içeren bir değerlendirme raporu, (iv) öğrencinin GNSS veri işleme, deney tasarımı ve bilimsel raporlama becerilerinin gelişmesidir. Paylaşım izni bulunan kod ve analiz yönergeleri açık depoda yayımlanabilir; üçüncü taraf veri dosyaları lisansları izin vermedikçe yeniden dağıtılmayacaktır. Bulgular, yüksek tespit başarısı veya sahada güvenli kullanım iddiası şeklinde sunulmayacaktır. Sonuçların sonraki bağımsız alıcı deneylerine yöntem ve veri gereksinimi sağlaması beklenir; bu proje tek başına uçuş emniyeti veya operasyonel koruma sağlamaz.</w:t>
+        <w:t>Proje, önceden geliştirme verilerinde incelenmiş GNSS tutarsızlık prototipinin bağımsız PolaRx5 ölçümlerine aktarımını sınayacaktır. Beklenen çıktılar; (i) FGI Jammertest 2025 dosyalarının sürüm, lisans, alan ve yer gerçeği manifesti, (ii) ölçüm dönüşümünü doğrulayan SBF/RINEX adaptörü ve kalite testleri, (iii) jamming ve spoofing olayları için yeni alarm, kaçırma ve gecikme sonuçlarını içeren dondurulmuş değerlendirme raporu, (iv) tekrarlanabilir analiz betikleri ve öğrencinin GNSS veri işleme/araştırma becerileridir. Paylaşım izni bulunan kod ve analiz yönergeleri açık depoda yayımlanabilir; veri dosyaları lisans izin vermedikçe dağıtılmayacaktır. Bulgular yüksek tespit başarısı veya sahada güvenli kullanım iddiası olarak sunulmayacaktır.</w:t>
       </w:r>
     </w:p>
     <w:p>
@@ -2088,7 +2136,7 @@
           <w:rFonts w:ascii="Arial" w:hAnsi="Arial"/>
           <w:i w:val="0"/>
         </w:rPr>
-        <w:t>Bu çalışma canlı RF yayını, açık havada girişim üretimi, uçuş kontrolü veya insan katılımcı içermeyen çevrimdışı kayıt analizidir. İnsan katılımcı ya da kişisel iletişim verisi kullanılmayacaktır. GPS/konum kayıtları hassas olabileceğinden, yalnızca kullanım izni olan veri işlenecek; paylaşımda gerekli olmayan kesin koordinatlar yayımlanmayacak ve veri lisansına uyulacaktır. Etik kurul gerekliliği konusunda nihai kararı yürütücü kurumun ilgili kurulu verir; başvuru öncesinde danışmanla teyit edilmelidir. TEXBAT ve Jammertest sonuçları etiketli saldırı aralıklarıyla sınırlıdır; normal verinin tüm zamanları saldırısız kabul edilmez. Prototipteki alarm, GNSS tutarsızlığı göstergesidir ve tek başına spoofing veya jamming nedenini ispatlamaz. Bağımsız IMU/yönelim ve yeni alıcı holdout'u bulunmadıkça kinematik saldırı doğrulaması ve çapraz-alıcı genelleme iddiası kurulmayacaktır.</w:t>
+        <w:t>Bu çalışma canlı RF yayını, girişim üretimi, uçuş kontrolü veya insan katılımcı içermeyen çevrimdışı kayıt analizidir. GPS/konum kayıtları hassas olabileceğinden yalnızca kullanım izni doğrulanmış veri işlenecek; gereksiz koordinatlar yayımlanmayacak ve veri lisansına uyulacaktır. Etik kurul gerekliliği danışman ve yürütücü kurumla teyit edilmelidir. Prototip alarmı GNSS ölçüm tutarsızlığı göstergesidir; tek başına spoofing veya jamming nedenini ispatlamaz. Jammertest 2025 dosyalarına erişim ve biçim uyumu doğrulanmadan bağımsız performans sonucu vaat edilmez.</w:t>
       </w:r>
     </w:p>
     <w:p>
@@ -2159,7 +2207,7 @@
         <w:ind w:left="317" w:hanging="173"/>
       </w:pPr>
       <w:r>
-        <w:t>[7] Finnish Geospatial Research Institute, “FGI Jammertest 2025 GNSS interference dataset,” Fairdata Etsin, 2026. Veri erişimi ve indirme durumu başvuru öncesi tekrar doğrulanacaktır. https://etsin.fairdata.fi/dataset/095782a8-4e31-456e-8719-7021b4c96362.</w:t>
+        <w:t>[7] Finnish Geospatial Research Institute, “FGI Jammertest 2025 GNSS interference dataset,” Fairdata Etsin, 2026. Katalog kaydı SBF/RINEX ve yer gerçeği bilgisi bildirir; dosya indirme erişimi ve yerel şema doğrulaması tamamlanmamıştır. https://etsin.fairdata.fi/dataset/095782a8-4e31-456e-8719-7021b4c96362.</w:t>
       </w:r>
     </w:p>
     <w:p>
@@ -2169,15 +2217,6 @@
       </w:pPr>
       <w:r>
         <w:t>[8] Jammertest 2024, Zenodo sürüm 3, GNSS interference dataset. DOI: 10.5281/zenodo.15911589. Kullanılan olay zamanları ve kapsam için kaynak belgeleriyle tekrar doğrulama yapılacaktır.</w:t>
-      </w:r>
-    </w:p>
-    <w:p>
-      <w:pPr>
-        <w:spacing w:after="60"/>
-        <w:ind w:left="317" w:hanging="173"/>
-      </w:pPr>
-      <w:r>
-        <w:t>[9] T. A. Rodrigues ve diğerleri, “In-flight positional and energy use data set of a DJI Matrice 100 quadcopter for small package delivery,” Scientific Data, 8, 155, 2021. DOI: 10.1038/s41597-021-00930-x. Bu kayıtlar yalnızca ön çalışma/önceden kullanılmış veri bağlamındadır; bağımsız test olarak sunulmayacaktır.</w:t>
       </w:r>
     </w:p>
     <w:p>
@@ -2205,7 +2244,7 @@
         <w:ind w:left="317" w:hanging="173"/>
       </w:pPr>
       <w:r>
-        <w:t>Danışmanla proje kapsamını ve 12 aylık takvimi netleştirin. Özellikle yeni alıcıda bağımsız normal kalibrasyon/test oturumu sağlayıp sağlayamayacağınızı teyit edin.</w:t>
+        <w:t>Danışmanla proje kapsamını ve 12 aylık takvimi netleştirin. Yeni veriye erişim ve SBF/RINEX dosyalarını çözümleme imkânını başvuru öncesi teyit edin.</w:t>
       </w:r>
     </w:p>
     <w:p>
@@ -2215,7 +2254,7 @@
         <w:ind w:left="317" w:hanging="173"/>
       </w:pPr>
       <w:r>
-        <w:t>Jammertest 2025 veya eşdeğer yeni alıcı kaydının erişimini, lisansını ve olay/temiz zaman etiketlerini başvuru öncesinde kontrol edin. Erişim yoksa bu taslaktaki B planı uygulanır ve bağımsız başarı vaadi verilmez.</w:t>
+        <w:t>FGI Jammertest 2025 dosyalarının indirme erişimini, lisansını, veri sürümünü, olay etiketlerini ve temiz zaman tanımını başvuru öncesinde doğrulayın. Erişim yoksa bağımsız başarı vaadi vermeyin ve kapsamı danışmanla yeniden belirleyin.</w:t>
       </w:r>
     </w:p>
     <w:p>
@@ -3028,19 +3067,16 @@
     <w:rsid w:val="00FC693F"/>
     <w:pPr>
       <w:keepNext/>
-      <w:pBdr>
-        <w:bottom w:val="single" w:sz="8" w:space="4" w:color="4F81BD" w:themeColor="accent1"/>
-      </w:pBdr>
       <w:spacing w:after="80" w:line="240" w:lineRule="auto" w:before="0"/>
       <w:contextualSpacing/>
     </w:pPr>
     <w:rPr>
       <w:rFonts w:asciiTheme="majorHAnsi" w:eastAsiaTheme="majorEastAsia" w:hAnsiTheme="majorHAnsi" w:cstheme="majorBidi" w:ascii="Arial" w:hAnsi="Arial"/>
       <w:b/>
-      <w:color w:val="17365D"/>
+      <w:color w:val="000000"/>
       <w:spacing w:val="5"/>
       <w:kern w:val="28"/>
-      <w:sz w:val="46"/>
+      <w:sz w:val="42"/>
       <w:szCs w:val="52"/>
     </w:rPr>
   </w:style>

</xml_diff>

<commit_message>
FGI holdout erişim ve değerlendirme protokolünü netleştir
</commit_message>
<xml_diff>
--- a/output/docs/TUBITAK_2209A_GNSS_TYBS_Metin_Taslagi.docx
+++ b/output/docs/TUBITAK_2209A_GNSS_TYBS_Metin_Taslagi.docx
@@ -7,7 +7,7 @@
         <w:pStyle w:val="Title"/>
       </w:pPr>
       <w:r>
-        <w:t>Bağımsız Jammertest 2025 Verisinde GNSS Tutarsızlık İzleyicisinin Değerlendirilmesi</w:t>
+        <w:t>Yeni Bir GNSS Alıcısında Girişim Tespitinin Aktarılabilirliği</w:t>
       </w:r>
     </w:p>
     <w:p>
@@ -22,7 +22,7 @@
           <w:color w:val="1E6D78"/>
           <w:sz w:val="22"/>
         </w:rPr>
-        <w:t>2026 TYBS başvuru alanları için düzenlenebilir metin taslağı</w:t>
+        <w:t>FGI Jammertest 2025 PolaRx5 kayıtlarında dondurulmuş değerlendirme</w:t>
       </w:r>
     </w:p>
     <w:p>
@@ -36,7 +36,7 @@
           <w:i w:val="0"/>
           <w:sz w:val="18"/>
         </w:rPr>
-        <w:t>Kullanım notu: 2026 çağrısında öneri TYBS alanlarına girilir ve sistem tarafından oluşturulur; bu Word dosyası yükleme belgesi değildir. Sağlanan PDF 2024 döneminden ve başka bir projeye aittir. Köşeli parantezli bilgiler, veri erişimi, yöntem ve kaynaklar başvuru sahibi ile danışman tarafından doğrulanmalıdır.</w:t>
+        <w:t>Kullanım notu: 2026 çağrısında öneri TYBS alanlarına girilir ve sistem tarafından oluşturulur; bu Word dosyası yükleme belgesi değildir. Sağlanan PDF 2024 döneminden ve başka bir projeye aittir. Başvuru sahibi ve danışman köşeli parantezli alanları tamamlamalıdır. Veri kataloğu ve küçük bir referans dosyası kontrol edilmiştir; saldırı senaryosu ölçümlerinin indirilmesi ve etiketlerinin doğrulanması henüz tamamlanmamıştır.</w:t>
       </w:r>
     </w:p>
     <w:p>
@@ -148,7 +148,7 @@
                 <w:b w:val="0"/>
                 <w:sz w:val="16"/>
               </w:rPr>
-              <w:t>Bağımsız Jammertest 2025 Verisinde GNSS Tutarsızlık İzleyicisinin Değerlendirilmesi</w:t>
+              <w:t>Yeni Bir GNSS Alıcısında Girişim Tespitinin Aktarılabilirliği</w:t>
             </w:r>
           </w:p>
         </w:tc>
@@ -471,7 +471,7 @@
                 <w:b w:val="0"/>
                 <w:sz w:val="16"/>
               </w:rPr>
-              <w:t>GNSS; Jammertest 2025; bağımsız değerlendirme; Septentrio PolaRx5; spoofing; jamming</w:t>
+              <w:t>GNSS; alıcılar arası aktarım; bağımsız değerlendirme; PolaRx5; spoofing; jamming</w:t>
             </w:r>
           </w:p>
         </w:tc>
@@ -500,7 +500,7 @@
           <w:rFonts w:ascii="Arial" w:hAnsi="Arial"/>
           <w:i w:val="0"/>
         </w:rPr>
-        <w:t>Bu araştırma, mevcut GNSS ölçüm tutarlılığı izleme prototipinin daha önce geliştirme ve eşik ayarında kullanılmamış Jammertest 2025 kayıtlarına aktarılabilirliğini inceleyecektir. Veri kataloğu kayıtları Septentrio PolaRx5 alıcısından SBF/RINEX ölçümleri ve girişim senaryosu yer gerçeği içerdiğini bildiriyor; ancak dosya erişimi ve yerel şema doğrulaması henüz tamamlanmadı. Bu nedenle önce belirli veri sürümü, lisans, dosyalar, saat eşlemesi ve gözlenebilir alanlar doğrulanacak, test dosyaları açılmadan kod, model, profil, eşikler ve analiz protokolü dondurulacaktır. SBF veya RINEX kayıtları sürümlü adaptörle ortak şemaya aktarılacak; ölçüm kaybı, birim dönüşümü ve geçersiz örnekler kaydedilecek, kaynakta bulunmayan alanlar üretilmeyecektir. Saldırı etiketleri yalnızca çıkarım sonrası uygulanarak jamming ve spoofing olayları için olay düzeyinde yeni alarm, kaçırılan olay ve ilk alarm gecikmesi hesaplanacaktır. Yanlış alarm yalnızca yer gerçeğinde açıkça temiz/normal olarak tanımlanmış süre bulunursa raporlanacaktır. Mevcut TEXBAT ve Jammertest 2024 kayıtları geliştirme sürecinde incelendiği için bağımsız test sayılmayacaktır. 2025 dosyaları edinilemez veya gerekli alanları içermezse bağımsız performans iddiası kurulmayacak; kısıt, sonuç ve B planı açıkça raporlanacaktır.</w:t>
+        <w:t>Bu araştırma, mevcut GNSS ölçüm tutarlılığı izleme prototipinin daha önce geliştirme ve eşik ayarında kullanılmamış farklı bir alıcıya aktarılabilirliğini inceleyecektir. FGI Jammertest 2025 kataloğu Septentrio PolaRx5 ölçümleri, SBF/RINEX biçimleri ve kontrollü girişim senaryoları bildiriyor. 27 Ekim 2026 tarihli Metax manifestinde 102 dosya listeleniyor; katalog boyutları toplamı 874.580.271 bayttır; 27 Ekim 2026'da 299 baytlık statik referans koordinat dosyası indirildi, ancak aynı gün Metax dosya kullanılabilirlik ucu 405 `Download is not enabled` döndürdü; olay etiketleri dosya düzeyinde incelenmedi. Bu nedenle ilk hedef, araştırma için gerekli bir saldırı kaydı, eşleşen olay yer gerçeği ve kullanılabilir alanların erişimini doğrulamaktır. Erişim kapısı geçilirse dosya sürümü ve özeti kaydedilecek; test verisi açılmadan prototip kodu, profil, eşikler ve analiz protokolü dondurulacaktır. SBF/RINEX kayıtları deterministik adaptörle ortak şemaya aktarılacak; olmayan özellikler üretilmeyecektir. Jamming ve spoofing olayları için yeni alarm, kaçırılan olay ve gecikme hesaplanacak; yanlış alarm yalnızca açıkça temiz etiketlenmiş sürelerde raporlanacaktır. Mevcut TEXBAT ve Jammertest 2024 kayıtları geliştirme sürecinde incelendiği için bağımsız test sayılmayacaktır. Gerekli olay dosyalarına erişilemezse bağımsız performans sonucu iddia edilmeyecek ve başvuru kapsamı veri sağlayıcıyla teyit edilmiş uygulanabilir bir kaynağa göre yeniden belirlenmelidir.</w:t>
       </w:r>
     </w:p>
     <w:p>
@@ -514,7 +514,7 @@
           <w:color w:val="5B6573"/>
           <w:sz w:val="16"/>
         </w:rPr>
-        <w:t>Özet uzunluğu: 155 kelime (2026 çağrısı: 25-450 kelime).</w:t>
+        <w:t>Özet uzunluğu: 179 kelime (2026 çağrısı: 25-450 kelime).</w:t>
       </w:r>
     </w:p>
     <w:p>
@@ -544,7 +544,7 @@
           <w:color w:val="5B6573"/>
           <w:sz w:val="16"/>
         </w:rPr>
-        <w:t>TYBS metni (1,541 karakter; asgari 350)</w:t>
+        <w:t>TYBS metni (1,698 karakter; asgari 350)</w:t>
       </w:r>
     </w:p>
     <w:p>
@@ -557,7 +557,7 @@
           <w:rFonts w:ascii="Arial" w:hAnsi="Arial"/>
           <w:i w:val="0"/>
         </w:rPr>
-        <w:t>GNSS spoofing, alıcının yanlış fakat makul görünen ölçümlere yönelmesine; jamming ise sinyal hizmetinin bozulmasına yol açabilir ve iki tehdit ayrı değerlendirilmelidir. Literatür, tespit performansının alıcıda erişilebilen sinyal/ölçüm özelliklerine ve alıcıya özgü kalibrasyona bağlı olduğunu; yanlış alarm sınırının açık tanımlanması gerektiğini gösterir [1, 2]. Code-minus-carrier ölçütleri yardımcı olabilir, ancak multipath ve iyonosferden de etkilendiğinden tek başına saldırı kanıtı değildir [3, 4]. Bu nedenle bir kayıt üzerinde ayarlanan prototipin farklı alıcı ve veri biçiminde aynı davranışı göstereceği varsayılamaz. Etsin kataloğu, FGI Jammertest 2025 veri kümesini Septentrio PolaRx5 alıcı kayıtları, SBF/RINEX biçimleri ve senaryo yer gerçeğiyle tanımlar [7]. Prototipin mevcut değerlendirmeleri TEXBAT işlenmiş GRID ölçümleri, Jammertest 2024 ve başka kaynaklarla sınırlıdır; bunlar geliştirme sürecinde incelendiğinden bağımsız test değildir. Bununla birlikte 2025 kümesinin dosyaları henüz alınarak incelenmedi ve uygulamanın SBF/RINEX desteği doğrulanmadı. Araştırma sorusu şudur: “Önceden dondurulmuş GNSS tutarsızlık izleme prototipi, daha önce kullanılmamış Jammertest 2025 PolaRx5 kayıtlarında etiketli jamming ve spoofing olaylarını hangi kapsam ve gecikmeyle belirler; açıkça temiz etiketlenmiş süre varsa ne sıklıkta alarm üretir?” Çalışma yeni bir evrensel tespit yöntemi iddia etmeyecek; veri erişimi, gözlenebilir alanlar, uyarlama ve olay düzeyindeki performans sınırlarını tekrarlanabilir biçimde ölçecektir.</w:t>
+        <w:t>GNSS spoofing, alıcının yanlış fakat makul görünen ölçümlere yönelmesine; jamming ise sinyal hizmetinin bozulmasına yol açabilir ve iki tehdit ayrı değerlendirilmelidir. Literatür, tespit performansının alıcıda erişilebilen sinyal/ölçüm özelliklerine ve alıcıya özgü kalibrasyona bağlı olduğunu; yanlış alarm sınırının açık tanımlanması gerektiğini gösterir [1, 2]. Code-minus-carrier ölçütleri yardımcı olabilir, ancak multipath ve iyonosferden de etkilendiğinden tek başına saldırı kanıtı değildir [3, 4]. Bu nedenle bir kayıt üzerinde ayarlanan prototipin farklı alıcı ve veri biçiminde aynı davranışı göstereceği varsayılamaz. Etsin kataloğu Jammertest 2025 kayıtlarını PolaRx5, SBF/RINEX ve senaryo yer gerçeğiyle tanımlar [7]. 27 Ekim 2026 Metax manifestinde 102 dosya listeleniyor; katalog boyutları toplamı 874.580.271 bayttır; erişim Open ve lisans CC BY 4.0 görünür; ancak şimdiye kadar indirilebilen küçük `ground_truth_static.csv` yalnızca statik referans koordinatlarını içerir. Dosya kullanılabilirlik ucu 405 `Download is not enabled` döndürdü; senaryo ölçümleri ve olay etiketleri edinilmedi. Bu nedenle önerinin bilimsel sorusu şu koşulla sınanacaktır: “Saldırı kayıtları ve olay yer gerçeği edinilebilirse, önceden dondurulmuş GNSS tutarsızlık izleyicisi daha önce kullanılmamış PolaRx5 kayıtlarında jamming/spoofing olaylarını hangi kapsam ve gecikmeyle belirler; açıkça temiz dönem varsa ne sıklıkta alarm üretir?” Mevcut TEXBAT ve Jammertest 2024 sonuçları geliştirme sürecinde incelendiğinden bağımsız test değildir. Çalışma evrensel tespit başarısı iddia etmeyecek; veri erişimini, gözlenebilir alanları, uyarlamayı ve olay düzeyindeki performans sınırlarını raporlayacaktır.</w:t>
       </w:r>
     </w:p>
     <w:p>
@@ -579,7 +579,7 @@
           <w:color w:val="5B6573"/>
           <w:sz w:val="16"/>
         </w:rPr>
-        <w:t>TYBS metni (1,107 karakter; asgari 350)</w:t>
+        <w:t>TYBS metni (1,104 karakter; asgari 350)</w:t>
       </w:r>
     </w:p>
     <w:p>
@@ -592,7 +592,7 @@
           <w:rFonts w:ascii="Arial" w:hAnsi="Arial"/>
           <w:i w:val="0"/>
         </w:rPr>
-        <w:t>Projenin amacı, geliştirme verilerinden ayrı Jammertest 2025 PolaRx5 kayıtlarında mevcut GNSS tutarsızlık izleme prototipinin sıfır-atış aktarım performansını ölçmek ve kapsam sınırlarını raporlamaktır. İlk hedef, veri kataloğundaki sürüm, indirme izni, lisans, dosya listesi, yer gerçeği ve olay saatlerini doğrulayıp SHA-256 manifesti hazırlamaktır. İkinci hedef, veri dosyasında bulunduğu doğrulanan SBF veya RINEX alanlarını zaman ve birim bilgilerini koruyarak ortak şemaya aktaran, testlerle doğrulanmış bir adaptör geliştirmektir. Üçüncü hedef, prototip sürümünü, yapılandırmayı, profilleri, eşikleri ve metrikleri saldırı kayıtları açılmadan dondurup testi yeniden ayarlama yapmadan çalıştırmaktır. Dördüncü hedef, jamming ve spoofing olaylarını ayrı raporlayarak olay düzeyinde yeni alarm, kaçırma ve gecikmeyi hesaplamaktır; yanlış alarm oranı yalnızca yer gerçeğinde açıkça temiz olduğu belirtilen zamanlar varsa verilecektir. Başarı, yüksek tespit oranı vaat etmek değil; kilitli bağımsız değerlendirmeyi, veri/özellik kapsamını ve başarısız sonuçları yeniden üretilebilir biçimde raporlamaktır.</w:t>
+        <w:t>Projenin amacı, geliştirme verilerinden ayrı PolaRx5 kayıtlarında mevcut GNSS tutarsızlık izleyicisinin sıfır-atış aktarımını değerlendirmek ve kapsam sınırlarını raporlamaktır. İlk hedef, gerekli saldırı SBF/RINEX dosyalarına ve eşleşen olay yer gerçeğine fiilî erişimi doğrulamak; erişilebilir her dosyanın katalog sürümünü, boyutunu ve SHA-256 özetini kaydetmektir. İkinci hedef, yalnız erişilebilir ve gerekli alanları taşıdığı doğrulanan dosyalar için deterministik adaptör ve kalite kontrolleri geliştirmektir. Üçüncü hedef, gerçek olay ölçümleri açılmadan prototip, mevcut profil, eşikler ve metrikleri dondurmaktır. Dördüncü hedef, erişim koşulu sağlanırsa jamming/spoofing olayları için yeni alarm, kaçırma ve gecikmeyi ayrı raporlamaktır. Yanlış alarm oranı yalnızca yer gerçeğinde açıkça temiz olduğu belirtilen sürelerde hesaplanacaktır. Veri erişim kapısı geçilemezse bağımsız başarı iddiası veya test sonucu sunulmayacaktır. Başarı ölçütü yüksek performans vaat etmek değil, bağımsız değerlendirme yapılabilirliğini doğrulayıp sonucu ve sınırları yeniden üretilebilir biçimde raporlamaktır.</w:t>
       </w:r>
     </w:p>
     <w:p>
@@ -622,7 +622,7 @@
           <w:color w:val="5B6573"/>
           <w:sz w:val="16"/>
         </w:rPr>
-        <w:t>TYBS metni (1,448 karakter; asgari 350)</w:t>
+        <w:t>TYBS metni (1,441 karakter; asgari 350)</w:t>
       </w:r>
     </w:p>
     <w:p>
@@ -635,7 +635,7 @@
           <w:rFonts w:ascii="Arial" w:hAnsi="Arial"/>
           <w:i w:val="0"/>
         </w:rPr>
-        <w:t>Araştırma, önceden geliştirme ve ayar süreçlerinde kullanılmamış Jammertest 2025 PolaRx5 kayıtlarında yapılacak, kayıt temelli sıfır-atış değerlendirmedir. Önce katalog sürümü, indirme erişimi, lisans, dosya listesi, yayınlanmış biçim açıklaması ve olay saatlerinin tanımı doğrulanır; dosyalar edinilebilirse bayt düzeyinde SHA-256 manifesti çıkarılır. SBF/RINEX dönüştürücüsü yalnızca yayınlanmış alan sözleşmesi ve yapay test örnekleriyle hazırlanır. Gerçek test ölçümleri veya saldırı etiketleri çözülmeden prototip kodu, model dosyaları, mevcut profil, eşikler, yapılandırma, adaptör ve analiz protokolü SHA-256 ile dondurulur. Sonra ölçümler ortak şemaya aktarılır; zaman birimleri, epoch atlamaları, geçersiz fix ve eksik alanlar korunur. Olmayan C/N0, pseudorange, taşıyıcı fazı veya temiz etiket türetilmez. Jamming ve spoofing etiketleri yalnızca dondurulmuş çıkarım tamamlandıktan sonra uygulanır ve ayrı raporlanır; temel çıktılar olay başına yeni alarm, kaçırılan olay sayısı ve ilk yeni alarm gecikmesidir. Alarmın olay başında zaten etkin olması yeni tespit sayılmaz. Gecikme için olay saati belirsizliği ve kaydın sonuna kadar tespit edilmeyen olaylar gösterilir. Yanlış alarm/saat yalnızca veri sağlayıcının yer gerçeğinde açıkça temiz/normal olarak işaretlediği sürelerde hesaplanır; böyle süre yoksa bu metrik verilmez. Dönüştürme veya erişim başarısızsa performans sonucu üretilmez; bu durum ve sınırlı B planı raporlanır [2, 7].</w:t>
+        <w:t>Araştırma, geliştirme ve ayar süreçlerinde kullanılmamış Jammertest 2025 PolaRx5 kayıtlarında kayıt temelli sıfır-atış değerlendirmesi olarak tasarlanmıştır. 27 Ekim 2026 Metax manifesti 102 dosya ve toplam 874.580.271 bayt payload boyutu (yaklaşık 834,06 MiB) bildiriyor; katalog Open ve CC BY 4.0 olarak işaretli. 27 Ekim 2026'da 299 baytlık statik referans koordinat dosyası indirildi; saldırı senaryosu SBF/RINEX kayıtları ve olay etiketleri henüz edinilmedi. Bu nedenle ilk iş paketi, en az bir saldırı senaryosu ölçümü ile eşleşen olay yer gerçeğini indirip şema ve zaman uyumunu doğrulamaktır. Bu geçiş kapısı sağlanmazsa performans değerlendirmesi başlatılmaz ve başvuru kapsamı veri erişimi teyit edilen kaynakla danışman eşliğinde yeniden belirlenir. Veri edinilirse katalogdaki dosya özeti ve lisans kaydedilir; SBF/RINEX dönüştürücüsü yayınlanmış alan sözleşmesi ve yapay test örnekleriyle hazırlanır. Gerçek saldırı etiketleri açılmadan prototip kodu, model, profil, eşikler, yapılandırma, adaptör ve analiz protokolü SHA-256 ile dondurulur. Ölçümler ortak şemaya aktarılır; zaman birimleri, epoch atlamaları, geçersiz fix ve eksik alanlar korunur. Olmayan C/N0, pseudorange, taşıyıcı fazı veya temiz etiket türetilmez. Etiketler yalnızca çıkarım tamamlandıktan sonra uygulanır; olay başına yeni alarm, kaçırma ve ilk alarm gecikmesi raporlanır. Yanlış alarm/saat yalnızca açıkça temiz/normal etiketlenmiş zamanlarda hesaplanır.</w:t>
       </w:r>
     </w:p>
     <w:p>
@@ -819,7 +819,7 @@
                 <w:b w:val="0"/>
                 <w:sz w:val="15"/>
               </w:rPr>
-              <w:t>1. Erişim ve test protokolünü dondurma</w:t>
+              <w:t>1. Veri erişim kapısı ve protokol</w:t>
             </w:r>
           </w:p>
         </w:tc>
@@ -859,7 +859,7 @@
                 <w:b w:val="0"/>
                 <w:sz w:val="15"/>
               </w:rPr>
-              <w:t>FGI Jammertest 2025 dosya erişimi, lisans, sürüm, SHA-256 ve yer gerçeği doğrulanır. Erişim sağlanamazsa analiz başlamaz ve durum danışmanla yeniden kapsamlandırılır.</w:t>
+              <w:t>En az bir saldırı ölçümü ve eşleşen olay yer gerçeği fiilen edinilir; lisans, sürüm, dosya özeti ve zaman şeması doğrulanır. Erişim sağlanamazsa performans analizi başlamaz ve danışmanla kapsam yeniden belirlenir.</w:t>
             </w:r>
           </w:p>
         </w:tc>
@@ -1350,7 +1350,7 @@
                 <w:b w:val="0"/>
                 <w:sz w:val="15"/>
               </w:rPr>
-              <w:t>FGI Jammertest 2025 dosyalarının indirilememesi veya erişim koşulunun değişmesi</w:t>
+              <w:t>Saldırı ölçümlerine veya eşleşen olay yer gerçeğine erişilememesi</w:t>
             </w:r>
           </w:p>
         </w:tc>
@@ -1370,7 +1370,7 @@
                 <w:b w:val="0"/>
                 <w:sz w:val="15"/>
               </w:rPr>
-              <w:t>Orta / yüksek. Katalog kaydı var; yerel dosya erişimi henüz doğrulanmadı.</w:t>
+              <w:t>Yüksek / yüksek. Katalog dosya listesini ve açık lisansı bildiriyor; şimdiye kadar yalnızca 299 baytlık statik referans dosyası indirildi.</w:t>
             </w:r>
           </w:p>
         </w:tc>
@@ -1390,7 +1390,7 @@
                 <w:b w:val="0"/>
                 <w:sz w:val="15"/>
               </w:rPr>
-              <w:t>Başlangıçta yayıncı/katalog erişimi ve lisans yazılı olarak teyit edilir. Dosyalar edinilemezse bağımsız performans sonucu veya genelleme iddiası kurulmaz; danışmanla kapsam yeniden belirlenir ve yalnızca erişilebilir veriler için veri-kapsamı analizi yapılır.</w:t>
+              <w:t>İlk iş paketi veri erişim kapısıdır. Saldırı SBF/RINEX dosyası ve olay yer gerçeği edinilip şema doğrulanmadan performans analizi başlamaz. Erişim sağlanamazsa bağımsız performans sonucu iddia edilmez; danışmanla kapsam, erişimi doğrulanmış bir veri kaynağına göre değiştirilir.</w:t>
             </w:r>
           </w:p>
         </w:tc>
@@ -2000,7 +2000,7 @@
                 <w:b w:val="0"/>
                 <w:sz w:val="15"/>
               </w:rPr>
-              <w:t>FGI Jammertest 2025 PolaRx5 kayıtları bu araştırmanın bağımsız test adayıdır; önceki TEXBAT/Jammertest kayıtları yalnız geliştirme/ön çalışma içindir.</w:t>
+              <w:t>FGI Jammertest 2025 kataloğunda 102 dosya listelenir; statik referans koordinat dosyası indirildi. Saldırı senaryo kayıtları bağımsız test adayıdır ancak henüz edinilmedi.</w:t>
             </w:r>
           </w:p>
         </w:tc>
@@ -2020,7 +2020,7 @@
                 <w:b w:val="0"/>
                 <w:sz w:val="15"/>
               </w:rPr>
-              <w:t>2025 dosyalarının indirme erişimi, lisansı, sürümü, alanları ve yer gerçeği başvuru öncesi doğrulanmalı; yerel SBF/RINEX desteği geliştirilmelidir.</w:t>
+              <w:t>Saldırı SBF/RINEX kayıtları ve olay yer gerçeği için indirmenin çalıştığı, alanların ve saatlerin çözümlendiği başvuru öncesi doğrulanmalıdır; önceki TEXBAT/Jammertest verileri bağımsız test olarak kullanılmamalıdır.</w:t>
             </w:r>
           </w:p>
         </w:tc>
@@ -2102,6 +2102,7 @@
     <w:p>
       <w:pPr>
         <w:pStyle w:val="Heading1"/>
+        <w:pageBreakBefore/>
       </w:pPr>
       <w:r>
         <w:t>4 Araştırma önerisinin yaygın etkisi</w:t>
@@ -2116,7 +2117,7 @@
           <w:rFonts w:ascii="Arial" w:hAnsi="Arial"/>
           <w:i w:val="0"/>
         </w:rPr>
-        <w:t>Proje, önceden geliştirme verilerinde incelenmiş GNSS tutarsızlık prototipinin bağımsız PolaRx5 ölçümlerine aktarımını sınayacaktır. Beklenen çıktılar; (i) FGI Jammertest 2025 dosyalarının sürüm, lisans, alan ve yer gerçeği manifesti, (ii) ölçüm dönüşümünü doğrulayan SBF/RINEX adaptörü ve kalite testleri, (iii) jamming ve spoofing olayları için yeni alarm, kaçırma ve gecikme sonuçlarını içeren dondurulmuş değerlendirme raporu, (iv) tekrarlanabilir analiz betikleri ve öğrencinin GNSS veri işleme/araştırma becerileridir. Paylaşım izni bulunan kod ve analiz yönergeleri açık depoda yayımlanabilir; veri dosyaları lisans izin vermedikçe dağıtılmayacaktır. Bulgular yüksek tespit başarısı veya sahada güvenli kullanım iddiası olarak sunulmayacaktır.</w:t>
+        <w:t>Proje, önceden geliştirme verilerinde incelenmiş GNSS tutarsızlık prototipinin bağımsız PolaRx5 ölçümlerine aktarılabilirliğini sınamak üzere tasarlanmıştır; bu sonuç, saldırı ölçümleri ve olay yer gerçeğine erişim doğrulanmasına bağlıdır. Beklenen çıktılar; (i) veri sürümü, lisansı, dosya özetleri ve gözlenebilir alan manifesti, (ii) edinilebilen biçim için deterministik adaptör ve kalite kontrolleri, (iii) erişim kapısı geçilirse jamming/spoofing olayları için dondurulmuş alarm, kaçırma ve gecikme raporu, (iv) tekrarlanabilir analiz betikleri ve öğrencinin GNSS veri işleme becerileridir. Paylaşım izni bulunan kod ve yönergeler yayımlanabilir; veri dosyaları lisans izin vermedikçe dağıtılmaz. Çalışma yüksek tespit başarısı veya sahada güvenli kullanım iddiası üretmez.</w:t>
       </w:r>
     </w:p>
     <w:p>
@@ -2207,7 +2208,7 @@
         <w:ind w:left="317" w:hanging="173"/>
       </w:pPr>
       <w:r>
-        <w:t>[7] Finnish Geospatial Research Institute, “FGI Jammertest 2025 GNSS interference dataset,” Fairdata Etsin, 2026. Katalog kaydı SBF/RINEX ve yer gerçeği bilgisi bildirir; dosya indirme erişimi ve yerel şema doğrulaması tamamlanmamıştır. https://etsin.fairdata.fi/dataset/095782a8-4e31-456e-8719-7021b4c96362.</w:t>
+        <w:t>[7] Finnish Geospatial Research Institute, “FGI Jammertest 2025 GNSS interference dataset,” Fairdata Etsin, 2026. Katalog 102 dosya ve toplam 874.580.271 bayt payload boyutu, Open erişim, CC BY 4.0 ve PolaRx5 SBF/RINEX kayıtlarını bildirir. 27 Ekim 2026'da indirilen `ground_truth_static.csv` statik referans koordinatları içerir; saldırı kayıtları/olay etiketleri indirilip doğrulanmamıştır. Katalog metadata manifesti `data_manifests/fgi_jammertest_2025.json` içindedir. https://etsin.fairdata.fi/dataset/095782a8-4e31-456e-8719-7021b4c96362.</w:t>
       </w:r>
     </w:p>
     <w:p>
@@ -2244,7 +2245,7 @@
         <w:ind w:left="317" w:hanging="173"/>
       </w:pPr>
       <w:r>
-        <w:t>Danışmanla proje kapsamını ve 12 aylık takvimi netleştirin. Yeni veriye erişim ve SBF/RINEX dosyalarını çözümleme imkânını başvuru öncesi teyit edin.</w:t>
+        <w:t>Danışmanla proje kapsamını ve 12 aylık takvimi netleştirin. Başvuru öncesi en az bir SBF/RINEX saldırı kaydının ve ona karşılık gelen olay yer gerçeğinin indirilmesini, şemasının ve zamanının çözümlenmesini doğrulayın.</w:t>
       </w:r>
     </w:p>
     <w:p>
@@ -2254,7 +2255,7 @@
         <w:ind w:left="317" w:hanging="173"/>
       </w:pPr>
       <w:r>
-        <w:t>FGI Jammertest 2025 dosyalarının indirme erişimini, lisansını, veri sürümünü, olay etiketlerini ve temiz zaman tanımını başvuru öncesinde doğrulayın. Erişim yoksa bağımsız başarı vaadi vermeyin ve kapsamı danışmanla yeniden belirleyin.</w:t>
+        <w:t>Katalogdaki `ground_truth_static.csv` yalnızca statik koordinat referansıdır; saldırı başlangıç/bitiş etiketi değildir. Gerçek olay etiketlerinin kaynağını, saat dilimini ve temiz süre tanımını ayrıca doğrulayın. Bu erişim kapısı geçilmezse bağımsız başarı vaadi vermeyin ve kapsamı danışmanla değiştirin.</w:t>
       </w:r>
     </w:p>
     <w:p>

</xml_diff>